<commit_message>
docs: remove trailing blank project brief page [generated-public-data]
</commit_message>
<xml_diff>
--- a/docs/files/PsyLens_project_brief.docx
+++ b/docs/files/PsyLens_project_brief.docx
@@ -7597,21 +7597,6 @@
         <w:t>McMillan, D. W., &amp; Chavis, D. M. (1986). Sense of community: A definition and theory. Journal of Community Psychology, 14(1), 6–23.</w:t>
       </w:r>
     </w:p>
-    <w:p>
-      <w:pPr>
-        <w:spacing w:before="440"/>
-        <w:jc w:val="center"/>
-      </w:pPr>
-      <w:r>
-        <w:rPr>
-          <w:rFonts w:ascii="Microsoft YaHei" w:hAnsi="Microsoft YaHei" w:eastAsia="Microsoft YaHei"/>
-          <w:b w:val="0"/>
-          <w:color w:val="5B6C78"/>
-          <w:sz w:val="17"/>
-        </w:rPr>
-        <w:t>Copyright © 2026 Sherlock0717. All rights reserved.</w:t>
-      </w:r>
-    </w:p>
     <w:sectPr>
       <w:headerReference w:type="default" r:id="rId9"/>
       <w:footerReference w:type="default" r:id="rId10"/>

</xml_diff>

<commit_message>
docs: finalize public project scope and brief
</commit_message>
<xml_diff>
--- a/docs/files/PsyLens_project_brief.docx
+++ b/docs/files/PsyLens_project_brief.docx
@@ -104,7 +104,7 @@
           <w:color w:val="1F2F3D"/>
           <w:sz w:val="21"/>
         </w:rPr>
-        <w:t>心理学启发的社区反馈编码、分析与可靠性评测</w:t>
+        <w:t>社区反馈分析案例、可复现数据处理流程、心理学双层编码、可靠性评测与自动校准原型</w:t>
       </w:r>
     </w:p>
     <w:p>
@@ -155,7 +155,7 @@
     </w:p>
     <w:p>
       <w:pPr>
-        <w:spacing w:before="2200"/>
+        <w:spacing w:before="960"/>
       </w:pPr>
       <w:r>
         <w:rPr>
@@ -178,6 +178,20 @@
       </w:pPr>
       <w:r>
         <w:t>执行摘要</w:t>
+      </w:r>
+    </w:p>
+    <w:p>
+      <w:pPr>
+        <w:widowControl/>
+      </w:pPr>
+      <w:r>
+        <w:rPr>
+          <w:rFonts w:ascii="Microsoft YaHei" w:hAnsi="Microsoft YaHei" w:eastAsia="Microsoft YaHei"/>
+          <w:b w:val="0"/>
+          <w:color w:val="1F2F3D"/>
+          <w:sz w:val="21"/>
+        </w:rPr>
+        <w:t>PsyLens 是一个社区反馈分析案例，同时提供可复现的数据处理流程、心理学启发的双层编码方法、可靠性评测工具和可接入模型的自动校准原型。真实模型运行结果、模型之间的一致性比较和人工金标准不属于当前版本的交付范围。</w:t>
       </w:r>
     </w:p>
     <w:p>
@@ -1892,7 +1906,7 @@
           <w:color w:val="1F2F3D"/>
           <w:sz w:val="21"/>
         </w:rPr>
-        <w:t>信息不足时保留显式不确定类别。</w:t>
+        <w:t>信息不足时保留暂时不确定类别。</w:t>
       </w:r>
     </w:p>
     <w:p>
@@ -4375,7 +4389,7 @@
           <w:color w:val="1F2F3D"/>
           <w:sz w:val="21"/>
         </w:rPr>
-        <w:t>平衡 × 胜任受挫是数量最高的具体组合，说明角色、装备和机制强度经常与“难以发挥作用”同时出现。平衡 × 公平受损与匹配 × 公平受损提示部分玩家把负面结果归因于规则或分配方式。沟通透明 × 信任落差数量较少，但构念对应关系清晰。</w:t>
+        <w:t>平衡 × 胜任受挫是数量最高的具体组合，说明角色、装备和机制强度经常与“难以发挥作用”同时出现。平衡 × 公平受损与匹配 × 公平受损提示部分玩家把负面结果归因于规则或分配方式。沟通透明 × 信任落差数量较少，但体验类型对应关系清晰。</w:t>
       </w:r>
     </w:p>
     <w:p>
@@ -6359,7 +6373,7 @@
         <w:pStyle w:val="Heading2"/>
       </w:pPr>
       <w:r>
-        <w:t>6.1 下一阶段一致性评测</w:t>
+        <w:t>6.1 编码一致性评测方法（扩展）</w:t>
       </w:r>
     </w:p>
     <w:p>
@@ -6373,7 +6387,7 @@
           <w:color w:val="1F2F3D"/>
           <w:sz w:val="21"/>
         </w:rPr>
-        <w:t>建议从平台、主要话题、主要机制和不确定类别中分层抽样，由两名编码者独立判断证据纳入、表层话题与机制标签。记录独立结果、争议类型、裁决理由和手册修订，并计算适用于名义变量的 Krippendorff’s alpha。</w:t>
+        <w:t>编码一致性评测从平台、主要话题、主要机制和不确定类别中分层抽样，由两名编码者独立判断证据纳入、表层话题与机制标签。记录独立结果、争议类型、裁决理由和手册修订，并计算适用于名义变量的 Krippendorff’s alpha。Krippendorff’s alpha 是一种衡量多名编码者判断一致程度的统计量。</w:t>
       </w:r>
     </w:p>
     <w:p>
@@ -6387,7 +6401,7 @@
           <w:color w:val="1F2F3D"/>
           <w:sz w:val="21"/>
         </w:rPr>
-        <w:t>一致性指标需要与混淆矩阵、争议样本和返修成本一起解释。较高一致性只能说明编码者使用同一规则时结果稳定，不能单独证明构念完整或产品结论有效。</w:t>
+        <w:t>一致性指标需要与混淆矩阵、争议样本和返修成本一起解释。较高一致性只能说明编码者使用同一规则时结果稳定，不能单独证明体验类型划分完整或产品结论有效。</w:t>
       </w:r>
     </w:p>
     <w:p>
@@ -6395,7 +6409,158 @@
         <w:pStyle w:val="Heading1"/>
       </w:pPr>
       <w:r>
-        <w:t>7. 产品方向与验证设计</w:t>
+        <w:t>7. 文案质量检查</w:t>
+      </w:r>
+    </w:p>
+    <w:p>
+      <w:pPr>
+        <w:widowControl/>
+      </w:pPr>
+      <w:r>
+        <w:rPr>
+          <w:rFonts w:ascii="Microsoft YaHei" w:hAnsi="Microsoft YaHei" w:eastAsia="Microsoft YaHei"/>
+          <w:b w:val="0"/>
+          <w:color w:val="1F2F3D"/>
+          <w:sz w:val="21"/>
+        </w:rPr>
+        <w:t>公开文案由 tools/lint_public_copy.py 自动检查，覆盖 README、页面、方法文档以及 Python 中面向读者的文字。检查器识别模板化宣传词、负面框架句式、过长句子、页面中的内部工程状态和未解释的英文缩写。检查器设有发布门槛（一道自动关卡）：只有文案检查达到设定级别，页面和文档才允许发布。仓库在 Ubuntu 与 Windows 两套环境运行持续集成，包含编译检查、Ruff 静态检查、测试套件、文案质量门槛，以及一次本地固定示例校准流程的冒烟运行与公开字段安全检查。</w:t>
+      </w:r>
+    </w:p>
+    <w:p>
+      <w:pPr>
+        <w:pStyle w:val="Heading1"/>
+      </w:pPr>
+      <w:r>
+        <w:t>8. 自动校准工具</w:t>
+      </w:r>
+    </w:p>
+    <w:p>
+      <w:pPr>
+        <w:widowControl/>
+      </w:pPr>
+      <w:r>
+        <w:rPr>
+          <w:rFonts w:ascii="Microsoft YaHei" w:hAnsi="Microsoft YaHei" w:eastAsia="Microsoft YaHei"/>
+          <w:b w:val="0"/>
+          <w:color w:val="1F2F3D"/>
+          <w:sz w:val="21"/>
+        </w:rPr>
+        <w:t>仓库提供一套编码复检与争议分析工具，用于观察标签在多次独立判断下是否稳定。它是可接入模型的自动校准原型，当前公开版本不发布模型成绩。</w:t>
+      </w:r>
+    </w:p>
+    <w:p>
+      <w:pPr>
+        <w:pStyle w:val="Heading2"/>
+      </w:pPr>
+      <w:r>
+        <w:t>8.1 分层抽样与三路复检</w:t>
+      </w:r>
+    </w:p>
+    <w:p>
+      <w:pPr>
+        <w:widowControl/>
+      </w:pPr>
+      <w:r>
+        <w:rPr>
+          <w:rFonts w:ascii="Microsoft YaHei" w:hAnsi="Microsoft YaHei" w:eastAsia="Microsoft YaHei"/>
+          <w:b w:val="0"/>
+          <w:color w:val="1F2F3D"/>
+          <w:sz w:val="21"/>
+        </w:rPr>
+        <w:t>抽样从公开证据中取 300 条主样本，另加 30 条重测样本，按平台、话题、机制、编码来源、纳入状态和文本长度分层。重测样本用于观察同一条证据在重复判断下是否得到一致结果。两部分合并后统一编号并重新排序，公开样本只保留复检所需的脱敏字段，来源、平台、当前标签和重测关系写入私有映射文件。</w:t>
+      </w:r>
+    </w:p>
+    <w:p>
+      <w:pPr>
+        <w:widowControl/>
+      </w:pPr>
+      <w:r>
+        <w:rPr>
+          <w:rFonts w:ascii="Microsoft YaHei" w:hAnsi="Microsoft YaHei" w:eastAsia="Microsoft YaHei"/>
+          <w:b w:val="0"/>
+          <w:color w:val="1F2F3D"/>
+          <w:sz w:val="21"/>
+        </w:rPr>
+        <w:t>三名独立 Reviewer 使用不同的判断结构，但共用同一套标签集合和定义：Reviewer A 严格依据编码手册分类；Reviewer B 先概括主要诉求再匹配标签；Reviewer C 先排除相邻标签再做判断。三名 Reviewer 互不查看彼此结果。共识分析汇总一致标签与争议标签，争议项转化为编码手册的改进提案。</w:t>
+      </w:r>
+    </w:p>
+    <w:p>
+      <w:pPr>
+        <w:pStyle w:val="Heading2"/>
+      </w:pPr>
+      <w:r>
+        <w:t>8.2 运行方式与扩展入口</w:t>
+      </w:r>
+    </w:p>
+    <w:p>
+      <w:pPr>
+        <w:widowControl/>
+      </w:pPr>
+      <w:r>
+        <w:rPr>
+          <w:rFonts w:ascii="Microsoft YaHei" w:hAnsi="Microsoft YaHei" w:eastAsia="Microsoft YaHei"/>
+          <w:b w:val="0"/>
+          <w:color w:val="1F2F3D"/>
+          <w:sz w:val="21"/>
+        </w:rPr>
+        <w:t>工具提供两种运行方式。本地固定示例模式按关键词生成确定性示例输出，用来验证数据流、输出格式和统计流程；它只用于验证流程，不是真实模型校准结果。OpenAI-compatible 接口作为扩展入口保留，可在本地配置环境变量后接入外部模型；当前公开版本不包含真实模型运行结果，也不发布模型成绩。</w:t>
+      </w:r>
+    </w:p>
+    <w:tbl>
+      <w:tblPr>
+        <w:tblW w:type="auto" w:w="0"/>
+        <w:tblLook w:firstColumn="1" w:firstRow="1" w:lastColumn="0" w:lastRow="0" w:noHBand="0" w:noVBand="1" w:val="04A0"/>
+      </w:tblPr>
+      <w:tblGrid>
+        <w:gridCol w:w="9688"/>
+      </w:tblGrid>
+      <w:tr>
+        <w:tc>
+          <w:tcPr>
+            <w:tcW w:type="dxa" w:w="9688"/>
+            <w:shd w:fill="EDF5F9"/>
+            <w:tcBorders>
+              <w:top w:val="single" w:sz="7" w:color="2176A3"/>
+              <w:left w:val="single" w:sz="7" w:color="2176A3"/>
+              <w:bottom w:val="single" w:sz="7" w:color="2176A3"/>
+              <w:right w:val="single" w:sz="7" w:color="2176A3"/>
+            </w:tcBorders>
+          </w:tcPr>
+          <w:p>
+            <w:r>
+              <w:rPr>
+                <w:rFonts w:ascii="Microsoft YaHei" w:hAnsi="Microsoft YaHei" w:eastAsia="Microsoft YaHei"/>
+                <w:b/>
+                <w:color w:val="2176A3"/>
+                <w:sz w:val="21"/>
+              </w:rPr>
+              <w:t>结果性质说明</w:t>
+              <w:br/>
+            </w:r>
+            <w:r>
+              <w:rPr>
+                <w:rFonts w:ascii="Microsoft YaHei" w:hAnsi="Microsoft YaHei" w:eastAsia="Microsoft YaHei"/>
+                <w:b w:val="0"/>
+                <w:color w:val="1F2F3D"/>
+                <w:sz w:val="20"/>
+              </w:rPr>
+              <w:t>本地固定示例只用于验证流程；当前版本不发布模型成绩；自动结果定位为参考，不等同于人工金标准。</w:t>
+            </w:r>
+          </w:p>
+        </w:tc>
+      </w:tr>
+    </w:tbl>
+    <w:p>
+      <w:pPr>
+        <w:spacing w:after="0"/>
+      </w:pPr>
+    </w:p>
+    <w:p>
+      <w:pPr>
+        <w:pStyle w:val="Heading1"/>
+      </w:pPr>
+      <w:r>
+        <w:t>9. 产品方向与验证设计</w:t>
       </w:r>
     </w:p>
     <w:p>
@@ -6986,7 +7151,7 @@
         <w:pStyle w:val="Heading1"/>
       </w:pPr>
       <w:r>
-        <w:t>8. 解释边界</w:t>
+        <w:t>10. 解释边界</w:t>
       </w:r>
     </w:p>
     <w:p>
@@ -7084,7 +7249,7 @@
         <w:pStyle w:val="Heading1"/>
       </w:pPr>
       <w:r>
-        <w:t>9. 复现与仓库入口</w:t>
+        <w:t>11. 复现与仓库入口</w:t>
       </w:r>
     </w:p>
     <w:p>
@@ -7259,7 +7424,7 @@
                 <w:color w:val="1F2F3D"/>
                 <w:sz w:val="18"/>
               </w:rPr>
-              <w:t>公开样本、证据、manifest 与字段说明</w:t>
+              <w:t>公开样本、证据、文件校验记录与字段说明</w:t>
             </w:r>
           </w:p>
         </w:tc>

</xml_diff>

<commit_message>
docs: finalize PsyLens public release
Finalize the current public project scope, synchronize the formal project brief, keep real-model evaluation outside the current release, and publish the generated DOCX through Pages.
</commit_message>
<xml_diff>
--- a/docs/files/PsyLens_project_brief.docx
+++ b/docs/files/PsyLens_project_brief.docx
@@ -104,7 +104,7 @@
           <w:color w:val="1F2F3D"/>
           <w:sz w:val="21"/>
         </w:rPr>
-        <w:t>心理学启发的社区反馈编码、分析与可靠性评测</w:t>
+        <w:t>社区反馈分析案例、可复现数据处理流程、心理学双层编码、可靠性评测与自动校准原型</w:t>
       </w:r>
     </w:p>
     <w:p>
@@ -155,7 +155,7 @@
     </w:p>
     <w:p>
       <w:pPr>
-        <w:spacing w:before="2200"/>
+        <w:spacing w:before="960"/>
       </w:pPr>
       <w:r>
         <w:rPr>
@@ -178,6 +178,20 @@
       </w:pPr>
       <w:r>
         <w:t>执行摘要</w:t>
+      </w:r>
+    </w:p>
+    <w:p>
+      <w:pPr>
+        <w:widowControl/>
+      </w:pPr>
+      <w:r>
+        <w:rPr>
+          <w:rFonts w:ascii="Microsoft YaHei" w:hAnsi="Microsoft YaHei" w:eastAsia="Microsoft YaHei"/>
+          <w:b w:val="0"/>
+          <w:color w:val="1F2F3D"/>
+          <w:sz w:val="21"/>
+        </w:rPr>
+        <w:t>PsyLens 是一个社区反馈分析案例，同时提供可复现的数据处理流程、心理学启发的双层编码方法、可靠性评测工具和可接入模型的自动校准原型。真实模型运行结果、模型之间的一致性比较和人工金标准不属于当前版本的交付范围。</w:t>
       </w:r>
     </w:p>
     <w:p>
@@ -1892,7 +1906,7 @@
           <w:color w:val="1F2F3D"/>
           <w:sz w:val="21"/>
         </w:rPr>
-        <w:t>信息不足时保留显式不确定类别。</w:t>
+        <w:t>信息不足时保留暂时不确定类别。</w:t>
       </w:r>
     </w:p>
     <w:p>
@@ -4375,7 +4389,7 @@
           <w:color w:val="1F2F3D"/>
           <w:sz w:val="21"/>
         </w:rPr>
-        <w:t>平衡 × 胜任受挫是数量最高的具体组合，说明角色、装备和机制强度经常与“难以发挥作用”同时出现。平衡 × 公平受损与匹配 × 公平受损提示部分玩家把负面结果归因于规则或分配方式。沟通透明 × 信任落差数量较少，但构念对应关系清晰。</w:t>
+        <w:t>平衡 × 胜任受挫是数量最高的具体组合，说明角色、装备和机制强度经常与“难以发挥作用”同时出现。平衡 × 公平受损与匹配 × 公平受损提示部分玩家把负面结果归因于规则或分配方式。沟通透明 × 信任落差数量较少，但体验类型对应关系清晰。</w:t>
       </w:r>
     </w:p>
     <w:p>
@@ -6359,7 +6373,7 @@
         <w:pStyle w:val="Heading2"/>
       </w:pPr>
       <w:r>
-        <w:t>6.1 下一阶段一致性评测</w:t>
+        <w:t>6.1 编码一致性评测方法（扩展）</w:t>
       </w:r>
     </w:p>
     <w:p>
@@ -6373,7 +6387,7 @@
           <w:color w:val="1F2F3D"/>
           <w:sz w:val="21"/>
         </w:rPr>
-        <w:t>建议从平台、主要话题、主要机制和不确定类别中分层抽样，由两名编码者独立判断证据纳入、表层话题与机制标签。记录独立结果、争议类型、裁决理由和手册修订，并计算适用于名义变量的 Krippendorff’s alpha。</w:t>
+        <w:t>编码一致性评测从平台、主要话题、主要机制和不确定类别中分层抽样，由两名编码者独立判断证据纳入、表层话题与机制标签。记录独立结果、争议类型、裁决理由和手册修订，并计算适用于名义变量的 Krippendorff’s alpha。Krippendorff’s alpha 是一种衡量多名编码者判断一致程度的统计量。</w:t>
       </w:r>
     </w:p>
     <w:p>
@@ -6387,7 +6401,7 @@
           <w:color w:val="1F2F3D"/>
           <w:sz w:val="21"/>
         </w:rPr>
-        <w:t>一致性指标需要与混淆矩阵、争议样本和返修成本一起解释。较高一致性只能说明编码者使用同一规则时结果稳定，不能单独证明构念完整或产品结论有效。</w:t>
+        <w:t>一致性指标需要与混淆矩阵、争议样本和返修成本一起解释。较高一致性只能说明编码者使用同一规则时结果稳定，不能单独证明体验类型划分完整或产品结论有效。</w:t>
       </w:r>
     </w:p>
     <w:p>
@@ -6395,7 +6409,158 @@
         <w:pStyle w:val="Heading1"/>
       </w:pPr>
       <w:r>
-        <w:t>7. 产品方向与验证设计</w:t>
+        <w:t>7. 文案质量检查</w:t>
+      </w:r>
+    </w:p>
+    <w:p>
+      <w:pPr>
+        <w:widowControl/>
+      </w:pPr>
+      <w:r>
+        <w:rPr>
+          <w:rFonts w:ascii="Microsoft YaHei" w:hAnsi="Microsoft YaHei" w:eastAsia="Microsoft YaHei"/>
+          <w:b w:val="0"/>
+          <w:color w:val="1F2F3D"/>
+          <w:sz w:val="21"/>
+        </w:rPr>
+        <w:t>公开文案由 tools/lint_public_copy.py 自动检查，覆盖 README、页面、方法文档以及 Python 中面向读者的文字。检查器识别模板化宣传词、负面框架句式、过长句子、页面中的内部工程状态和未解释的英文缩写。检查器设有发布门槛（一道自动关卡）：只有文案检查达到设定级别，页面和文档才允许发布。仓库在 Ubuntu 与 Windows 两套环境运行持续集成，包含编译检查、Ruff 静态检查、测试套件、文案质量门槛，以及一次本地固定示例校准流程的冒烟运行与公开字段安全检查。</w:t>
+      </w:r>
+    </w:p>
+    <w:p>
+      <w:pPr>
+        <w:pStyle w:val="Heading1"/>
+      </w:pPr>
+      <w:r>
+        <w:t>8. 自动校准工具</w:t>
+      </w:r>
+    </w:p>
+    <w:p>
+      <w:pPr>
+        <w:widowControl/>
+      </w:pPr>
+      <w:r>
+        <w:rPr>
+          <w:rFonts w:ascii="Microsoft YaHei" w:hAnsi="Microsoft YaHei" w:eastAsia="Microsoft YaHei"/>
+          <w:b w:val="0"/>
+          <w:color w:val="1F2F3D"/>
+          <w:sz w:val="21"/>
+        </w:rPr>
+        <w:t>仓库提供一套编码复检与争议分析工具，用于观察标签在多次独立判断下是否稳定。它是可接入模型的自动校准原型，当前公开版本不发布模型成绩。</w:t>
+      </w:r>
+    </w:p>
+    <w:p>
+      <w:pPr>
+        <w:pStyle w:val="Heading2"/>
+      </w:pPr>
+      <w:r>
+        <w:t>8.1 分层抽样与三路复检</w:t>
+      </w:r>
+    </w:p>
+    <w:p>
+      <w:pPr>
+        <w:widowControl/>
+      </w:pPr>
+      <w:r>
+        <w:rPr>
+          <w:rFonts w:ascii="Microsoft YaHei" w:hAnsi="Microsoft YaHei" w:eastAsia="Microsoft YaHei"/>
+          <w:b w:val="0"/>
+          <w:color w:val="1F2F3D"/>
+          <w:sz w:val="21"/>
+        </w:rPr>
+        <w:t>抽样从公开证据中取 300 条主样本，另加 30 条重测样本，按平台、话题、机制、编码来源、纳入状态和文本长度分层。重测样本用于观察同一条证据在重复判断下是否得到一致结果。两部分合并后统一编号并重新排序，公开样本只保留复检所需的脱敏字段，来源、平台、当前标签和重测关系写入私有映射文件。</w:t>
+      </w:r>
+    </w:p>
+    <w:p>
+      <w:pPr>
+        <w:widowControl/>
+      </w:pPr>
+      <w:r>
+        <w:rPr>
+          <w:rFonts w:ascii="Microsoft YaHei" w:hAnsi="Microsoft YaHei" w:eastAsia="Microsoft YaHei"/>
+          <w:b w:val="0"/>
+          <w:color w:val="1F2F3D"/>
+          <w:sz w:val="21"/>
+        </w:rPr>
+        <w:t>三名独立 Reviewer 使用不同的判断结构，但共用同一套标签集合和定义：Reviewer A 严格依据编码手册分类；Reviewer B 先概括主要诉求再匹配标签；Reviewer C 先排除相邻标签再做判断。三名 Reviewer 互不查看彼此结果。共识分析汇总一致标签与争议标签，争议项转化为编码手册的改进提案。</w:t>
+      </w:r>
+    </w:p>
+    <w:p>
+      <w:pPr>
+        <w:pStyle w:val="Heading2"/>
+      </w:pPr>
+      <w:r>
+        <w:t>8.2 运行方式与扩展入口</w:t>
+      </w:r>
+    </w:p>
+    <w:p>
+      <w:pPr>
+        <w:widowControl/>
+      </w:pPr>
+      <w:r>
+        <w:rPr>
+          <w:rFonts w:ascii="Microsoft YaHei" w:hAnsi="Microsoft YaHei" w:eastAsia="Microsoft YaHei"/>
+          <w:b w:val="0"/>
+          <w:color w:val="1F2F3D"/>
+          <w:sz w:val="21"/>
+        </w:rPr>
+        <w:t>工具提供两种运行方式。本地固定示例模式按关键词生成确定性示例输出，用来验证数据流、输出格式和统计流程；它只用于验证流程，不是真实模型校准结果。OpenAI-compatible 接口作为扩展入口保留，可在本地配置环境变量后接入外部模型；当前公开版本不包含真实模型运行结果，也不发布模型成绩。</w:t>
+      </w:r>
+    </w:p>
+    <w:tbl>
+      <w:tblPr>
+        <w:tblW w:type="auto" w:w="0"/>
+        <w:tblLook w:firstColumn="1" w:firstRow="1" w:lastColumn="0" w:lastRow="0" w:noHBand="0" w:noVBand="1" w:val="04A0"/>
+      </w:tblPr>
+      <w:tblGrid>
+        <w:gridCol w:w="9688"/>
+      </w:tblGrid>
+      <w:tr>
+        <w:tc>
+          <w:tcPr>
+            <w:tcW w:type="dxa" w:w="9688"/>
+            <w:shd w:fill="EDF5F9"/>
+            <w:tcBorders>
+              <w:top w:val="single" w:sz="7" w:color="2176A3"/>
+              <w:left w:val="single" w:sz="7" w:color="2176A3"/>
+              <w:bottom w:val="single" w:sz="7" w:color="2176A3"/>
+              <w:right w:val="single" w:sz="7" w:color="2176A3"/>
+            </w:tcBorders>
+          </w:tcPr>
+          <w:p>
+            <w:r>
+              <w:rPr>
+                <w:rFonts w:ascii="Microsoft YaHei" w:hAnsi="Microsoft YaHei" w:eastAsia="Microsoft YaHei"/>
+                <w:b/>
+                <w:color w:val="2176A3"/>
+                <w:sz w:val="21"/>
+              </w:rPr>
+              <w:t>结果性质说明</w:t>
+              <w:br/>
+            </w:r>
+            <w:r>
+              <w:rPr>
+                <w:rFonts w:ascii="Microsoft YaHei" w:hAnsi="Microsoft YaHei" w:eastAsia="Microsoft YaHei"/>
+                <w:b w:val="0"/>
+                <w:color w:val="1F2F3D"/>
+                <w:sz w:val="20"/>
+              </w:rPr>
+              <w:t>本地固定示例只用于验证流程；当前版本不发布模型成绩；自动结果定位为参考，不等同于人工金标准。</w:t>
+            </w:r>
+          </w:p>
+        </w:tc>
+      </w:tr>
+    </w:tbl>
+    <w:p>
+      <w:pPr>
+        <w:spacing w:after="0"/>
+      </w:pPr>
+    </w:p>
+    <w:p>
+      <w:pPr>
+        <w:pStyle w:val="Heading1"/>
+      </w:pPr>
+      <w:r>
+        <w:t>9. 产品方向与验证设计</w:t>
       </w:r>
     </w:p>
     <w:p>
@@ -6986,7 +7151,7 @@
         <w:pStyle w:val="Heading1"/>
       </w:pPr>
       <w:r>
-        <w:t>8. 解释边界</w:t>
+        <w:t>10. 解释边界</w:t>
       </w:r>
     </w:p>
     <w:p>
@@ -7084,7 +7249,7 @@
         <w:pStyle w:val="Heading1"/>
       </w:pPr>
       <w:r>
-        <w:t>9. 复现与仓库入口</w:t>
+        <w:t>11. 复现与仓库入口</w:t>
       </w:r>
     </w:p>
     <w:p>
@@ -7259,7 +7424,7 @@
                 <w:color w:val="1F2F3D"/>
                 <w:sz w:val="18"/>
               </w:rPr>
-              <w:t>公开样本、证据、manifest 与字段说明</w:t>
+              <w:t>公开样本、证据、文件校验记录与字段说明</w:t>
             </w:r>
           </w:p>
         </w:tc>

</xml_diff>